<commit_message>
Update UX review with deployed-site evidence and two prioritised findings
</commit_message>
<xml_diff>
--- a/documents/team-b/UX/Team-AB-Role-Entry-Workspace-UX-Review.docx
+++ b/documents/team-b/UX/Team-AB-Role-Entry-Workspace-UX-Review.docx
@@ -56,7 +56,20 @@
           <w:sz w:val="18"/>
           <w:szCs w:val="18"/>
         </w:rPr>
-        <w:t xml:space="preserve">Task: [UX REFINEMENT] – Integrated Workspace Navigation · Sprint 3 Week 1 · due 10/10/2026</w:t>
+        <w:t xml:space="preserve">Task: [UX INTEGRATION] – Applicant, Intern &amp; Mentor Entry-Flow Review · Sprint 3 Week 1 · due 10/10/2026</w:t>
+      </w:r>
+    </w:p>
+    <w:p>
+      <w:pPr>
+        <w:spacing w:after="40"/>
+      </w:pPr>
+      <w:r>
+        <w:rPr>
+          <w:color w:val="6B7280"/>
+          <w:sz w:val="18"/>
+          <w:szCs w:val="18"/>
+        </w:rPr>
+        <w:t xml:space="preserve">Review type: pre-implementation review, based on the existing prototype (App.tsx v5) and the DEV screens available</w:t>
       </w:r>
     </w:p>
     <w:p>
@@ -136,7 +149,7 @@
                 <w:sz w:val="20"/>
                 <w:szCs w:val="20"/>
               </w:rPr>
-              <w:t xml:space="preserve">Task description</w:t>
+              <w:t xml:space="preserve">PM handoff note for this task</w:t>
             </w:r>
           </w:p>
           <w:p>
@@ -145,7 +158,7 @@
                 <w:sz w:val="20"/>
                 <w:szCs w:val="20"/>
               </w:rPr>
-              <w:t xml:space="preserve">“Review the implemented role-based routing and integrated workspaces after DEV completes the first routing pass. Check that Applicant, Intern and Mentor users arrive in the expected context and that navigation, terminology, role-state presentation and visible actions remain consistent with the approved Core MVP and shared IMS experience. Record only focused UX corrections required for final Core MVP integration; do not introduce new business functionality.”</w:t>
+              <w:t xml:space="preserve">“UX (Farid) — Review the Applicant, Intern and Mentor entry flows based on the confirmed Team A/B routing approach. Identify any navigation, role-state or workspace inconsistencies and provide UX recommendations for the integrated user experience.”</w:t>
             </w:r>
           </w:p>
         </w:tc>
@@ -165,7 +178,7 @@
           <w:sz w:val="21"/>
           <w:szCs w:val="21"/>
         </w:rPr>
-        <w:t xml:space="preserve">This review checks the confirmed routing contract (Applicant → Team A workspace, Intern → Team B Intern workspace, Mentor → Team B Mentor workspace, all from shared_accounts.role) and the BA rules and acceptance criteria built on it (RR-01 to RR-10, AR-01 to AR-08, AC-RR01 to AC-RR12) against the refined Core MVP prototype (App.tsx v5), which was run in a browser with no console or page errors, and against DEV’s 3 October screenshots. Every correction below changes behaviour, wording or presentation of data that already exists; none adds business functionality.</w:t>
+        <w:t xml:space="preserve">This is a pre-implementation review. It checks the confirmed routing contract (Applicant → Team A workspace, Intern → Team B Intern workspace, Mentor → Team B Mentor workspace, all from shared_accounts.role) and the BA rules and acceptance criteria built on it (RR-01 to RR-10, AR-01 to AR-08, AC-RR01 to AC-RR12) against the existing Core MVP prototype (App.tsx v5), which was run in a browser with no console or page errors, and against the DEV screens available, which are the 3 October screenshots. Every recommendation changes behaviour, wording or presentation of data that already exists; none adds business functionality.</w:t>
       </w:r>
     </w:p>
     <w:tbl>
@@ -225,7 +238,7 @@
                 <w:sz w:val="20"/>
                 <w:szCs w:val="20"/>
               </w:rPr>
-              <w:t xml:space="preserve">DEV’s role-based routing could not be exercised from here (sign-in required), and the DEV screenshots on file predate the routing pass, so each finding carries a check to confirm on the deployed build. Team A’s Applicant screens were not reviewed; only the point where they hand off to Team B was.</w:t>
+              <w:t xml:space="preserve">This is a pre-implementation review based on the existing prototype and available screens; DEV’s role-based routing was not reviewed in the deployed build. Each finding therefore carries a check to confirm once the routing is deployed. Team A’s Applicant screens were not reviewed; only the point where they hand off to Team B was.</w:t>
             </w:r>
           </w:p>
         </w:tc>
@@ -397,7 +410,7 @@
           <w:sz w:val="24"/>
           <w:szCs w:val="24"/>
         </w:rPr>
-        <w:t xml:space="preserve">Checklist coverage</w:t>
+        <w:t xml:space="preserve">Coverage of the PM handoff note</w:t>
       </w:r>
     </w:p>
     <w:p>
@@ -416,7 +429,7 @@
           <w:sz w:val="21"/>
           <w:szCs w:val="21"/>
         </w:rPr>
-        <w:t xml:space="preserve">Review implemented role entry behaviour → Section 3 and findings 01–03.</w:t>
+        <w:t xml:space="preserve">Review the Applicant, Intern and Mentor entry flows against the confirmed routing approach → Section 3 and findings 01–03.</w:t>
       </w:r>
     </w:p>
     <w:p>
@@ -435,45 +448,7 @@
           <w:sz w:val="21"/>
           <w:szCs w:val="21"/>
         </w:rPr>
-        <w:t xml:space="preserve">Check Intern workspace navigation/state → Section 3.2; consistent, no correction needed.</w:t>
-      </w:r>
-    </w:p>
-    <w:p>
-      <w:pPr>
-        <w:pStyle w:val="ListParagraph"/>
-        <w:keepNext/>
-        <w:keepLines/>
-        <w:numPr>
-          <w:ilvl w:val="0"/>
-          <w:numId w:val="1"/>
-        </w:numPr>
-        <w:spacing w:after="80"/>
-      </w:pPr>
-      <w:r>
-        <w:rPr>
-          <w:sz w:val="21"/>
-          <w:szCs w:val="21"/>
-        </w:rPr>
-        <w:t xml:space="preserve">Check Mentor workspace navigation/state → Section 3.3; consistent, no correction needed.</w:t>
-      </w:r>
-    </w:p>
-    <w:p>
-      <w:pPr>
-        <w:pStyle w:val="ListParagraph"/>
-        <w:keepNext/>
-        <w:keepLines/>
-        <w:numPr>
-          <w:ilvl w:val="0"/>
-          <w:numId w:val="1"/>
-        </w:numPr>
-        <w:spacing w:after="80"/>
-      </w:pPr>
-      <w:r>
-        <w:rPr>
-          <w:sz w:val="21"/>
-          <w:szCs w:val="21"/>
-        </w:rPr>
-        <w:t xml:space="preserve">Identify integration-related UX inconsistencies → Section 4, findings 01–03.</w:t>
+        <w:t xml:space="preserve">Identify navigation, role-state or workspace inconsistencies → Section 4, findings 01–03.</w:t>
       </w:r>
     </w:p>
     <w:p>
@@ -492,7 +467,7 @@
           <w:sz w:val="21"/>
           <w:szCs w:val="21"/>
         </w:rPr>
-        <w:t xml:space="preserve">Provide prioritised correction handoff to DEV → Sections 4 and 7.</w:t>
+        <w:t xml:space="preserve">Provide UX recommendations for the integrated experience → Sections 4 and 7.</w:t>
       </w:r>
     </w:p>
     <w:p>
@@ -1253,7 +1228,7 @@
                 <w:sz w:val="17"/>
                 <w:szCs w:val="17"/>
               </w:rPr>
-              <w:t xml:space="preserve">The wrong-role screen shows a lock and “You are previewing as a Mentor” (prototype wording) with no way out; the user’s own tab still looks active (Fig. 4). The prototype has no screen at all for an account whose role cannot be resolved. The BA rules allow a redirect or a safe access state (AR-06) and leave the unknown-role screen to DEV/UX (RR-09, IC-02), so both are UX decisions.</w:t>
+              <w:t xml:space="preserve">The wrong-role screen shows a lock and “You are previewing as a Mentor” (prototype wording) with no way out; the user’s own tab still looks active. The prototype has no screen at all for an account whose role cannot be resolved. The BA rules allow a redirect or a safe access state (AR-06) and leave the unknown-role screen to DEV/UX (RR-09, IC-02), so both are UX decisions.</w:t>
             </w:r>
           </w:p>
         </w:tc>
@@ -1507,166 +1482,70 @@
         <w:t xml:space="preserve">Supporting evidence</w:t>
       </w:r>
     </w:p>
-    <w:tbl>
-      <w:tblPr>
-        <w:tblW w:type="pct" w:w="100%"/>
-        <w:tblBorders>
-          <w:top w:val="none"/>
-          <w:left w:val="none"/>
-          <w:bottom w:val="none"/>
-          <w:right w:val="none"/>
-          <w:insideH w:val="none"/>
-          <w:insideV w:val="none"/>
-        </w:tblBorders>
-      </w:tblPr>
-      <w:tblGrid>
-        <w:gridCol w:w="100"/>
-        <w:gridCol w:w="100"/>
-      </w:tblGrid>
-      <w:tr>
-        <w:trPr>
-          <w:cantSplit/>
-        </w:trPr>
-        <w:tc>
-          <w:tcPr>
-            <w:tcW w:type="pct" w:w="50%"/>
-            <w:tcMar>
-              <w:right w:type="dxa" w:w="100"/>
-            </w:tcMar>
-          </w:tcPr>
-          <w:p>
-            <w:pPr>
-              <w:jc w:val="center"/>
-            </w:pPr>
-            <w:r>
-              <w:drawing>
-                <wp:inline distT="0" distB="0" distL="0" distR="0">
-                  <wp:extent cx="2857500" cy="2095500"/>
-                  <wp:effectExtent t="0" r="0" b="0" l="0"/>
-                  <wp:docPr id="1" name="" descr="" title=""/>
-                  <wp:cNvGraphicFramePr>
-                    <a:graphicFrameLocks xmlns:a="http://schemas.openxmlformats.org/drawingml/2006/main" noChangeAspect="1"/>
-                  </wp:cNvGraphicFramePr>
-                  <a:graphic xmlns:a="http://schemas.openxmlformats.org/drawingml/2006/main">
-                    <a:graphicData uri="http://schemas.openxmlformats.org/drawingml/2006/picture">
-                      <pic:pic xmlns:pic="http://schemas.openxmlformats.org/drawingml/2006/picture">
-                        <pic:nvPicPr>
-                          <pic:cNvPr id="0" name="" descr=""/>
-                          <pic:cNvPicPr>
-                            <a:picLocks noChangeAspect="1" noChangeArrowheads="1"/>
-                          </pic:cNvPicPr>
-                        </pic:nvPicPr>
-                        <pic:blipFill>
-                          <a:blip r:embed="rId9" cstate="none"/>
-                          <a:srcRect/>
-                          <a:stretch>
-                            <a:fillRect/>
-                          </a:stretch>
-                        </pic:blipFill>
-                        <pic:spPr bwMode="auto">
-                          <a:xfrm>
-                            <a:off x="0" y="0"/>
-                            <a:ext cx="2857500" cy="2095500"/>
-                          </a:xfrm>
-                          <a:prstGeom prst="rect">
-                            <a:avLst/>
-                          </a:prstGeom>
-                        </pic:spPr>
-                      </pic:pic>
-                    </a:graphicData>
-                  </a:graphic>
-                </wp:inline>
-              </w:drawing>
-            </w:r>
-          </w:p>
-          <w:p>
-            <w:pPr>
-              <w:spacing w:before="40"/>
-              <w:jc w:val="center"/>
-            </w:pPr>
-            <w:r>
-              <w:rPr>
-                <w:i/>
-                <w:iCs/>
-                <w:color w:val="6B7280"/>
-                <w:sz w:val="16"/>
-                <w:szCs w:val="16"/>
-              </w:rPr>
-              <w:t xml:space="preserve">Fig. 3 — “Switch role” sits outside the prototype-tools label</w:t>
-            </w:r>
-          </w:p>
-        </w:tc>
-        <w:tc>
-          <w:tcPr>
-            <w:tcW w:type="pct" w:w="50%"/>
-            <w:tcMar>
-              <w:left w:type="dxa" w:w="100"/>
-            </w:tcMar>
-          </w:tcPr>
-          <w:p>
-            <w:pPr>
-              <w:jc w:val="center"/>
-            </w:pPr>
-            <w:r>
-              <w:drawing>
-                <wp:inline distT="0" distB="0" distL="0" distR="0">
-                  <wp:extent cx="2857500" cy="2095500"/>
-                  <wp:effectExtent t="0" r="0" b="0" l="0"/>
-                  <wp:docPr id="1" name="" descr="" title=""/>
-                  <wp:cNvGraphicFramePr>
-                    <a:graphicFrameLocks xmlns:a="http://schemas.openxmlformats.org/drawingml/2006/main" noChangeAspect="1"/>
-                  </wp:cNvGraphicFramePr>
-                  <a:graphic xmlns:a="http://schemas.openxmlformats.org/drawingml/2006/main">
-                    <a:graphicData uri="http://schemas.openxmlformats.org/drawingml/2006/picture">
-                      <pic:pic xmlns:pic="http://schemas.openxmlformats.org/drawingml/2006/picture">
-                        <pic:nvPicPr>
-                          <pic:cNvPr id="0" name="" descr=""/>
-                          <pic:cNvPicPr>
-                            <a:picLocks noChangeAspect="1" noChangeArrowheads="1"/>
-                          </pic:cNvPicPr>
-                        </pic:nvPicPr>
-                        <pic:blipFill>
-                          <a:blip r:embed="rId10" cstate="none"/>
-                          <a:srcRect/>
-                          <a:stretch>
-                            <a:fillRect/>
-                          </a:stretch>
-                        </pic:blipFill>
-                        <pic:spPr bwMode="auto">
-                          <a:xfrm>
-                            <a:off x="0" y="0"/>
-                            <a:ext cx="2857500" cy="2095500"/>
-                          </a:xfrm>
-                          <a:prstGeom prst="rect">
-                            <a:avLst/>
-                          </a:prstGeom>
-                        </pic:spPr>
-                      </pic:pic>
-                    </a:graphicData>
-                  </a:graphic>
-                </wp:inline>
-              </w:drawing>
-            </w:r>
-          </w:p>
-          <w:p>
-            <w:pPr>
-              <w:spacing w:before="40"/>
-              <w:jc w:val="center"/>
-            </w:pPr>
-            <w:r>
-              <w:rPr>
-                <w:i/>
-                <w:iCs/>
-                <w:color w:val="6B7280"/>
-                <w:sz w:val="16"/>
-                <w:szCs w:val="16"/>
-              </w:rPr>
-              <w:t xml:space="preserve">Fig. 4 — Access denied: prototype wording, no action (finding 02)</w:t>
-            </w:r>
-          </w:p>
-        </w:tc>
-      </w:tr>
-    </w:tbl>
+    <w:p>
+      <w:pPr>
+        <w:keepNext/>
+        <w:spacing w:after="40"/>
+        <w:jc w:val="center"/>
+      </w:pPr>
+      <w:r>
+        <w:drawing>
+          <wp:inline distT="0" distB="0" distL="0" distR="0">
+            <wp:extent cx="4000500" cy="2943225"/>
+            <wp:effectExtent t="0" r="0" b="0" l="0"/>
+            <wp:docPr id="1" name="" descr="" title=""/>
+            <wp:cNvGraphicFramePr>
+              <a:graphicFrameLocks xmlns:a="http://schemas.openxmlformats.org/drawingml/2006/main" noChangeAspect="1"/>
+            </wp:cNvGraphicFramePr>
+            <a:graphic xmlns:a="http://schemas.openxmlformats.org/drawingml/2006/main">
+              <a:graphicData uri="http://schemas.openxmlformats.org/drawingml/2006/picture">
+                <pic:pic xmlns:pic="http://schemas.openxmlformats.org/drawingml/2006/picture">
+                  <pic:nvPicPr>
+                    <pic:cNvPr id="0" name="" descr=""/>
+                    <pic:cNvPicPr>
+                      <a:picLocks noChangeAspect="1" noChangeArrowheads="1"/>
+                    </pic:cNvPicPr>
+                  </pic:nvPicPr>
+                  <pic:blipFill>
+                    <a:blip r:embed="rId9" cstate="none"/>
+                    <a:srcRect/>
+                    <a:stretch>
+                      <a:fillRect/>
+                    </a:stretch>
+                  </pic:blipFill>
+                  <pic:spPr bwMode="auto">
+                    <a:xfrm>
+                      <a:off x="0" y="0"/>
+                      <a:ext cx="4000500" cy="2943225"/>
+                    </a:xfrm>
+                    <a:prstGeom prst="rect">
+                      <a:avLst/>
+                    </a:prstGeom>
+                  </pic:spPr>
+                </pic:pic>
+              </a:graphicData>
+            </a:graphic>
+          </wp:inline>
+        </w:drawing>
+      </w:r>
+    </w:p>
+    <w:p>
+      <w:pPr>
+        <w:keepLines/>
+        <w:spacing w:after="200"/>
+        <w:jc w:val="center"/>
+      </w:pPr>
+      <w:r>
+        <w:rPr>
+          <w:i/>
+          <w:iCs/>
+          <w:color w:val="6B7280"/>
+          <w:sz w:val="18"/>
+          <w:szCs w:val="18"/>
+        </w:rPr>
+        <w:t xml:space="preserve">Fig. 3 — “Switch role” sits outside the prototype-tools label</w:t>
+      </w:r>
+    </w:p>
     <w:p>
       <w:pPr>
         <w:pStyle w:val="Heading1"/>

</xml_diff>